<commit_message>
UI: Photorealistic hero visuals with customer details and unobscured phone positioning. Add Sentry error tracking and Admin CLI tools.
</commit_message>
<xml_diff>
--- a/test_generated/01_plumber_generated.docx
+++ b/test_generated/01_plumber_generated.docx
@@ -83,7 +83,7 @@
           </w:tcPr>
           <w:p>
             <w:r>
-              <w:t xml:space="preserve">QTE-202604-947</w:t>
+              <w:t xml:space="preserve">QTE-202604-127</w:t>
             </w:r>
           </w:p>
         </w:tc>
@@ -104,7 +104,7 @@
           </w:tcPr>
           <w:p>
             <w:r>
-              <w:t xml:space="preserve">22 April 2026</w:t>
+              <w:t xml:space="preserve">23 April 2026</w:t>
             </w:r>
           </w:p>
         </w:tc>
@@ -127,7 +127,7 @@
           </w:tcPr>
           <w:p>
             <w:r>
-              <w:t xml:space="preserve">22 May 2026</w:t>
+              <w:t xml:space="preserve">23 May 2026</w:t>
             </w:r>
           </w:p>
         </w:tc>

</xml_diff>